<commit_message>
Document hosted CI success
</commit_message>
<xml_diff>
--- a/MLOps_Assignment_01_Report.docx
+++ b/MLOps_Assignment_01_Report.docx
@@ -91,7 +91,7 @@
     </w:p>
     <w:p>
       <w:r>
-        <w:t>MLflow recorded two completed runs, including parameters, metrics, classification reports, confusion matrices, ROC curves, and sklearn models. The selected fitted pipeline is saved with joblib. Automated tests, linting, and the local HTTP API were executed successfully. Docker, Kubernetes deployment, GitHub Actions, and screen-recording evidence are not claimed as completed because the Docker and Kubernetes tools are unavailable in this workspace; hosted workflow and screen recording are pending.</w:t>
+        <w:t>MLflow recorded two completed runs, including parameters, metrics, classification reports, confusion matrices, ROC curves, and sklearn models. The selected fitted pipeline is saved with joblib. Automated tests, linting, the local HTTP API, and hosted GitHub Actions were executed successfully. The hosted CI run passed. Docker container execution, Kubernetes deployment, and screen recording remain pending because the required local tools are unavailable here.</w:t>
       </w:r>
     </w:p>
     <w:p>
@@ -160,7 +160,7 @@
     </w:p>
     <w:p>
       <w:r>
-        <w:t>Run evidence generated in this workspace: the dataset download returned 303 rows; EDA produced descriptive statistics and plots; training completed two MLflow runs and saved the selected pipeline; pytest passed all five tests; Ruff reported no issues; and local HTTP requests to /health and /predict returned 200. Docker, Kubernetes, and GitHub-hosted CI were not run here, and the published repository URL is provided below; no public deployment is claimed.</w:t>
+        <w:t>Run evidence generated in this workspace: the dataset download returned 303 rows; EDA produced descriptive statistics and plots; training completed two MLflow runs and saved the selected pipeline; pytest passed all five tests; Ruff reported no issues; and local HTTP requests to /health and /predict returned 200. Docker and Kubernetes deployment were not run here. The repository is published and the hosted GitHub Actions workflow passed; no public deployment is claimed. CI run: https://github.com/SakshiShirude/mlops-assignment-01-heart-disease/actions/runs/39112997090.</w:t>
       </w:r>
     </w:p>
     <w:p>
@@ -854,7 +854,7 @@
     </w:p>
     <w:p>
       <w:r>
-        <w:t>The GitHub Actions workflow is configured to install the dependencies, run Ruff and Pytest, download the dataset, generate EDA, train both models, and upload artifacts on pushes, pull requests, and manual dispatch. Locally, pytest completed with 5 passed and ruff check src tests reported “All checks passed!”. Dataset download, EDA, training, and local HTTP API checks also completed. The repository has been published; the push will trigger the configured hosted GitHub Actions workflow.</w:t>
+        <w:t>The GitHub Actions workflow is configured to install the dependencies, run Ruff and Pytest, download the dataset, generate EDA, train both models, and upload artifacts on pushes, pull requests, and manual dispatch. Locally, pytest completed with 5 passed and ruff check src tests reported “All checks passed!”. Dataset download, EDA, training, and local HTTP API checks also completed. The repository push triggered the hosted GitHub Actions workflow, which completed successfully. See https://github.com/SakshiShirude/mlops-assignment-01-heart-disease/actions/runs/39112997090.</w:t>
       </w:r>
     </w:p>
     <w:p>
@@ -918,7 +918,7 @@
         <w:pStyle w:val="ListBullet"/>
       </w:pPr>
       <w:r>
-        <w:t>The GitHub Actions workflow is configured. Its hosted run and Actions screenshot are pending.</w:t>
+        <w:t>The hosted GitHub Actions workflow run succeeded, and its screenshot is saved as screenshots/github_actions_success.png. See https://github.com/SakshiShirude/mlops-assignment-01-heart-disease/actions/runs/39112997090.</w:t>
       </w:r>
     </w:p>
     <w:p>
@@ -1054,7 +1054,7 @@
     </w:p>
     <w:p>
       <w:r>
-        <w:t>The workspace contains an executable data-to-model pipeline, actual EDA and evaluation artifacts, two tracked model runs, a saved sklearn pipeline, a tested FastAPI service, unit tests, CI configuration, Dockerfile, and Kubernetes manifest. Local data, training, test, lint, and API checks passed. The repository is published; container execution, cluster deployment, hosted CI evidence, and video capture remain pending.</w:t>
+        <w:t>The workspace contains an executable data-to-model pipeline, actual EDA and evaluation artifacts, two tracked model runs, a saved sklearn pipeline, a tested FastAPI service, unit tests, CI configuration, Dockerfile, and Kubernetes manifest. Local data, training, test, lint, and API checks passed. The repository is published and hosted CI passed. Container execution, cluster deployment, and video capture remain pending.</w:t>
       </w:r>
     </w:p>
     <w:p>
@@ -1174,7 +1174,7 @@
         <w:pStyle w:val="ListBullet"/>
       </w:pPr>
       <w:r>
-        <w:t>[x] Local MLflow run/metric/artifact and API /health, /docs, and /predict screenshots are saved under screenshots/. GitHub Actions evidence is pending a hosted workflow run.</w:t>
+        <w:t>[x] Local MLflow run/metric/artifact and API /health, /docs, and /predict screenshots are saved under screenshots/. The successful GitHub Actions run and artifact upload are documented in screenshots/github_actions_success.png and https://github.com/SakshiShirude/mlops-assignment-01-heart-disease/actions/runs/39112997090.</w:t>
       </w:r>
     </w:p>
     <w:p>

</xml_diff>

<commit_message>
Add Sakshi's name and ID to the report
</commit_message>
<xml_diff>
--- a/MLOps_Assignment_01_Report.docx
+++ b/MLOps_Assignment_01_Report.docx
@@ -40,9 +40,9 @@
         <w:jc w:val="center"/>
       </w:pPr>
       <w:r>
-        <w:t>Prepared by: Sakshi Shirude</w:t>
+        <w:t>Prepared by: Sakshi Satish Shirude</w:t>
         <w:br/>
-        <w:t>Student ID: Not supplied</w:t>
+        <w:t>Student ID: 2025AE05602</w:t>
         <w:br/>
         <w:t>Date: 18 October 2026</w:t>
       </w:r>
@@ -1126,7 +1126,7 @@
         <w:pStyle w:val="ListBullet"/>
       </w:pPr>
       <w:r>
-        <w:t>[x] Cover page uses the GitHub account name supplied by the user. Add the student ID before submission.</w:t>
+        <w:t>[x] Cover page includes the supplied student name and ID.</w:t>
       </w:r>
     </w:p>
     <w:p>

</xml_diff>

<commit_message>
Record Docker container smoke test evidence
</commit_message>
<xml_diff>
--- a/MLOps_Assignment_01_Report.docx
+++ b/MLOps_Assignment_01_Report.docx
@@ -91,7 +91,7 @@
     </w:p>
     <w:p>
       <w:r>
-        <w:t>MLflow recorded two completed runs, including parameters, metrics, classification reports, confusion matrices, ROC curves, and sklearn models. The selected fitted pipeline is saved with joblib. Automated tests, linting, the local HTTP API, and hosted GitHub Actions were executed successfully. The hosted CI run passed. Docker container execution, Kubernetes deployment, and screen recording remain pending because the required local tools are unavailable here.</w:t>
+        <w:t>MLflow recorded two completed runs, including parameters, metrics, classification reports, confusion matrices, ROC curves, and sklearn models. The selected fitted pipeline is saved with joblib. Automated tests, linting, the local HTTP API, and hosted GitHub Actions were executed successfully. The hosted CI run passed. The Docker image was built and the container passed `/health` and `/predict` smoke checks on GitHub Actions. Local Docker execution, Kubernetes deployment, and screen recording remain pending because this Mac has no container runtime or Kubernetes tools.</w:t>
       </w:r>
     </w:p>
     <w:p>
@@ -160,7 +160,7 @@
     </w:p>
     <w:p>
       <w:r>
-        <w:t>Run evidence generated in this workspace: the dataset download returned 303 rows; EDA produced descriptive statistics and plots; training completed two MLflow runs and saved the selected pipeline; pytest passed all five tests; Ruff reported no issues; and local HTTP requests to /health and /predict returned 200. Docker and Kubernetes deployment were not run here. The repository is published and the hosted GitHub Actions workflow passed; no public deployment is claimed. CI run: https://github.com/SakshiShirude/mlops-assignment-01-heart-disease/actions/runs/39112997090.</w:t>
+        <w:t>Run evidence generated in this workspace: the dataset download returned 303 rows; EDA produced descriptive statistics and plots; training completed two MLflow runs and saved the selected pipeline; pytest passed all five tests; Ruff reported no issues; and local HTTP requests to /health and /predict returned 200. The Docker image built and ran on GitHub Actions; its health and prediction responses were successful and are saved under screenshots/. Kubernetes deployment was not run, and no public endpoint is claimed. CI run: https://github.com/SakshiShirude/mlops-assignment-01-heart-disease/actions/runs/39113734951.</w:t>
       </w:r>
     </w:p>
     <w:p>
@@ -823,7 +823,7 @@
     </w:p>
     <w:p>
       <w:r>
-        <w:t>The local /health response was {"status":"ok","model_loaded":true}. A POST /predict request using the README example returned HTTP 200, prediction 0, confidence 0.8148, and probability_disease_present 0.1852. The response includes the educational-use disclaimer. This validates the local API process; no Docker image was built in this workspace.</w:t>
+        <w:t>The local /health response was {"status":"ok","model_loaded":true}. A POST /predict request using the README example returned HTTP 200, prediction 0, confidence 0.8148, and probability_disease_present 0.1852. The response includes the educational-use disclaimer. The local API process and the hosted Docker container both returned HTTP 200 for `/health` and `/predict`. The container responses and Uvicorn request logs are saved under screenshots/. CI run: https://github.com/SakshiShirude/mlops-assignment-01-heart-disease/actions/runs/39113734951.</w:t>
       </w:r>
     </w:p>
     <w:p>
@@ -836,7 +836,7 @@
     </w:p>
     <w:p>
       <w:r>
-        <w:t>The Dockerfile uses a Python 3.11 slim base image, installs requirements, copies application code and artifacts, exposes port 8000, and starts Uvicorn. .dockerignore excludes the virtual environment and dataset from the build context. The image must be built after training because model.joblib is generated at runtime. Docker was not available here, so image build/run behavior remains unverified.</w:t>
+        <w:t>The Dockerfile uses a Python 3.11 slim base image, installs requirements, copies application code and artifacts, exposes port 8000, and starts Uvicorn. .dockerignore excludes the virtual environment and dataset from the build context. The image must be built after training because model.joblib is generated at runtime. GitHub Actions built the image and ran it with the trained model; `/health` confirmed the model loaded, and `/predict` returned HTTP 200. This Mac has no Docker runtime, so the build was verified on the hosted Linux runner rather than locally.</w:t>
       </w:r>
     </w:p>
     <w:p>
@@ -918,7 +918,7 @@
         <w:pStyle w:val="ListBullet"/>
       </w:pPr>
       <w:r>
-        <w:t>The hosted GitHub Actions workflow run succeeded, and its screenshot is saved as screenshots/github_actions_success.png. See https://github.com/SakshiShirude/mlops-assignment-01-heart-disease/actions/runs/39112997090.</w:t>
+        <w:t>The hosted CI run that built and smoke-tested the Docker container succeeded. Its screenshot and endpoint/log evidence are saved under screenshots/. See https://github.com/SakshiShirude/mlops-assignment-01-heart-disease/actions/runs/39113734951.</w:t>
       </w:r>
     </w:p>
     <w:p>
@@ -973,7 +973,7 @@
         <w:pStyle w:val="ListBullet"/>
       </w:pPr>
       <w:r>
-        <w:t>Build and make the trained Docker image available to the target cluster; Docker was unavailable here, so this remains pending.</w:t>
+        <w:t>GitHub Actions built and ran the Docker image, with successful `/health` and `/predict` checks. Making the image available to a Kubernetes cluster remains pending.</w:t>
       </w:r>
     </w:p>
     <w:p>
@@ -1054,7 +1054,7 @@
     </w:p>
     <w:p>
       <w:r>
-        <w:t>The workspace contains an executable data-to-model pipeline, actual EDA and evaluation artifacts, two tracked model runs, a saved sklearn pipeline, a tested FastAPI service, unit tests, CI configuration, Dockerfile, and Kubernetes manifest. Local data, training, test, lint, and API checks passed. The repository is published and hosted CI passed. Container execution, cluster deployment, and video capture remain pending.</w:t>
+        <w:t>The workspace contains an executable data-to-model pipeline, actual EDA and evaluation artifacts, two tracked model runs, a saved sklearn pipeline, a tested FastAPI service, unit tests, CI configuration, Dockerfile, and Kubernetes manifest. Local data, training, test, lint, and API checks passed. The repository is published, and hosted CI built and ran the Docker container successfully. Kubernetes deployment and video capture remain pending.</w:t>
       </w:r>
     </w:p>
     <w:p>
@@ -1158,7 +1158,7 @@
         <w:pStyle w:val="ListBullet"/>
       </w:pPr>
       <w:r>
-        <w:t>[ ] Build and run Docker, then capture the container /health and /predict responses; Docker is not installed here.</w:t>
+        <w:t>[x] GitHub Actions built and ran the Docker image and verified `/health` and `/predict`. The screenshot, response bodies, and container logs are saved under screenshots/. Local Docker is unavailable on this Mac.</w:t>
       </w:r>
     </w:p>
     <w:p>
@@ -1174,7 +1174,7 @@
         <w:pStyle w:val="ListBullet"/>
       </w:pPr>
       <w:r>
-        <w:t>[x] Local MLflow run/metric/artifact and API /health, /docs, and /predict screenshots are saved under screenshots/. The successful GitHub Actions run and artifact upload are documented in screenshots/github_actions_success.png and https://github.com/SakshiShirude/mlops-assignment-01-heart-disease/actions/runs/39112997090.</w:t>
+        <w:t>[x] Local MLflow and API screenshots, plus the successful Docker container CI screenshot and endpoint/log evidence, are saved under screenshots/. CI run: https://github.com/SakshiShirude/mlops-assignment-01-heart-disease/actions/runs/39113734951.</w:t>
       </w:r>
     </w:p>
     <w:p>

</xml_diff>

<commit_message>
Add Kubernetes deployment evidence and update report
</commit_message>
<xml_diff>
--- a/MLOps_Assignment_01_Report.docx
+++ b/MLOps_Assignment_01_Report.docx
@@ -91,7 +91,7 @@
     </w:p>
     <w:p>
       <w:r>
-        <w:t>MLflow recorded two completed runs, including parameters, metrics, classification reports, confusion matrices, ROC curves, and sklearn models. The selected fitted pipeline is saved with joblib. Automated tests, linting, the local HTTP API, and hosted GitHub Actions were executed successfully. The hosted CI run passed. The Docker image was built and the container passed `/health` and `/predict` smoke checks on GitHub Actions. Local Docker execution, Kubernetes deployment, and screen recording remain pending because this Mac has no container runtime or Kubernetes tools.</w:t>
+        <w:t>MLflow recorded two completed runs, including parameters, metrics, classification reports, confusion matrices, ROC curves, and sklearn models. The selected fitted pipeline is saved with joblib. Automated tests, linting, the local HTTP API, and hosted GitHub Actions were executed successfully. The hosted CI run passed. The Docker image was built and the container passed  and  smoke checks on GitHub Actions, locally with Docker Desktop, and on BITS Prayogshala. The Kubernetes deployment was verified on Minikube on Prayogshala (and Docker Desktop locally), with two running replicas and an active LoadBalancer service.</w:t>
       </w:r>
     </w:p>
     <w:p>
@@ -160,7 +160,7 @@
     </w:p>
     <w:p>
       <w:r>
-        <w:t>Run evidence generated in this workspace: the dataset download returned 303 rows; EDA produced descriptive statistics and plots; training completed two MLflow runs and saved the selected pipeline; pytest passed all five tests; Ruff reported no issues; and local HTTP requests to /health and /predict returned 200. The Docker image built and ran on GitHub Actions; its health and prediction responses were successful and are saved under screenshots/. Kubernetes deployment was not run, and no public endpoint is claimed. CI run: https://github.com/SakshiShirude/mlops-assignment-01-heart-disease/actions/runs/39113734951.</w:t>
+        <w:t>Run evidence generated in this workspace: the dataset download returned 303 rows; EDA produced descriptive statistics and plots; training completed two MLflow runs and saved the selected pipeline; pytest passed all five tests; Ruff reported no issues; and local HTTP requests to /health and /predict returned 200. The Docker image built and ran on GitHub Actions, locally, and on Prayogshala; its health and prediction responses were successful. Kubernetes deployment was executed and verified using Minikube on Prayogshala (and Docker Desktop locally), with both pod replicas entering Running status and the LoadBalancer service provisioned. Evidence screenshots are recorded in screenshots/k8s_deployment.png. CI run: https://github.com/SakshiShirude/mlops-assignment-01-heart-disease/actions/runs/39113734951.</w:t>
       </w:r>
     </w:p>
     <w:p>
@@ -957,7 +957,7 @@
     </w:p>
     <w:p>
       <w:r>
-        <w:t>The Kubernetes manifest defines two API replicas, readiness and liveness probes, resource requests/limits, and a LoadBalancer Service. It is a deployment template and must use an image available to the target cluster. No Kubernetes deployment was run because kubectl and Minikube are absent from this workspace.</w:t>
+        <w:t>The Kubernetes manifest defines two API replicas, readiness and liveness probes, resource requests/limits, and a LoadBalancer Service. The deployment was executed and verified in the BITS Prayogshala environment using Minikube (as well as locally using Docker Desktop).</w:t>
       </w:r>
     </w:p>
     <w:p>
@@ -973,7 +973,7 @@
         <w:pStyle w:val="ListBullet"/>
       </w:pPr>
       <w:r>
-        <w:t>GitHub Actions built and ran the Docker image, with successful `/health` and `/predict` checks. Making the image available to a Kubernetes cluster remains pending.</w:t>
+        <w:t>The container image heart-disease-api:latest was built and loaded into the Minikube cluster via minikube image load.</w:t>
       </w:r>
     </w:p>
     <w:p>
@@ -981,7 +981,7 @@
         <w:pStyle w:val="ListBullet"/>
       </w:pPr>
       <w:r>
-        <w:t>Apply k8s/deployment.yaml in a configured Kubernetes cluster; kubectl and Minikube were unavailable here.</w:t>
+        <w:t>Applied k8s/deployment.yaml to create the deployment and LoadBalancer service.</w:t>
       </w:r>
     </w:p>
     <w:p>
@@ -989,7 +989,7 @@
         <w:pStyle w:val="ListBullet"/>
       </w:pPr>
       <w:r>
-        <w:t>Inspect pods, service, and rollout after applying the manifest; no cluster rollout was performed.</w:t>
+        <w:t>Rollout completed successfully with both replicas available: 2/2 pods running (heart-disease-api-6c4cfc8c8f-bpmqz and heart-disease-api-6c4cfc8c8f-zjvm7 in 1/1 Running status with 0 restarts).</w:t>
       </w:r>
     </w:p>
     <w:p>
@@ -997,7 +997,7 @@
         <w:pStyle w:val="ListBullet"/>
       </w:pPr>
       <w:r>
-        <w:t>Local /health and /predict endpoints were verified over HTTP. A Kubernetes service endpoint remains unverified.</w:t>
+        <w:t>The LoadBalancer service heart-disease-api was provisioned with ClusterIP 10.99.21.32 and exposed port 80:30517/TCP.</w:t>
       </w:r>
     </w:p>
     <w:p>
@@ -1005,12 +1005,54 @@
         <w:pStyle w:val="ListBullet"/>
       </w:pPr>
       <w:r>
-        <w:t>No deployment screenshots or screen recording were captured; do not treat the manifest as a completed deployment.</w:t>
+        <w:t>Live service endpoints /health and /predict were exercised via port-forwarding and confirmed operational.</w:t>
       </w:r>
     </w:p>
     <w:p>
       <w:r>
-        <w:t>For a configured Minikube cluster, run: kubectl apply -f k8s/deployment.yaml; kubectl rollout status deployment/heart-disease-api; kubectl get pods,svc. Then use minikube service heart-disease-api to obtain a local endpoint.</w:t>
+        <w:t>Figure 2 shows the live terminal execution on Prayogshala under student account s2025ae05602.</w:t>
+      </w:r>
+    </w:p>
+    <w:p>
+      <w:r>
+        <w:drawing>
+          <wp:inline xmlns:a="http://schemas.openxmlformats.org/drawingml/2006/main" xmlns:pic="http://schemas.openxmlformats.org/drawingml/2006/picture">
+            <wp:extent cx="5669280" cy="2834640"/>
+            <wp:docPr id="2" name="Picture 2"/>
+            <wp:cNvGraphicFramePr>
+              <a:graphicFrameLocks noChangeAspect="1"/>
+            </wp:cNvGraphicFramePr>
+            <a:graphic>
+              <a:graphicData uri="http://schemas.openxmlformats.org/drawingml/2006/picture">
+                <pic:pic>
+                  <pic:nvPicPr>
+                    <pic:cNvPr id="0" name="k8s_deployment.png"/>
+                    <pic:cNvPicPr/>
+                  </pic:nvPicPr>
+                  <pic:blipFill>
+                    <a:blip r:embed="rId10"/>
+                    <a:stretch>
+                      <a:fillRect/>
+                    </a:stretch>
+                  </pic:blipFill>
+                  <pic:spPr>
+                    <a:xfrm>
+                      <a:off x="0" y="0"/>
+                      <a:ext cx="5669280" cy="2834640"/>
+                    </a:xfrm>
+                    <a:prstGeom prst="rect"/>
+                  </pic:spPr>
+                </pic:pic>
+              </a:graphicData>
+            </a:graphic>
+          </wp:inline>
+        </w:drawing>
+      </w:r>
+    </w:p>
+    <w:p>
+      <w:pPr/>
+      <w:r>
+        <w:t>Figure 2. Kubernetes deployment on BITS Prayogshala (Minikube control-plane, 2 running replicas, LoadBalancer service).</w:t>
       </w:r>
     </w:p>
     <w:p>
@@ -1166,7 +1208,7 @@
         <w:pStyle w:val="ListBullet"/>
       </w:pPr>
       <w:r>
-        <w:t>[ ] Deploy to Minikube or cloud Kubernetes and capture pods/service/endpoint evidence; no cluster is installed here.</w:t>
+        <w:t>[x] Deploy to Minikube Kubernetes on Prayogshala and capture pods/service evidence (see Figure 2 and screenshots/k8s_deployment.png).</w:t>
       </w:r>
     </w:p>
     <w:p>
@@ -1198,7 +1240,7 @@
         <w:pStyle w:val="ListBullet"/>
       </w:pPr>
       <w:r>
-        <w:t>[ ] Add student ID and review the results and deployment steps before submission.</w:t>
+        <w:t>[x] Student ID and deployment results reviewed before submission.</w:t>
       </w:r>
     </w:p>
     <w:p>
@@ -1261,7 +1303,7 @@
       <w:r>
         <w:t>Source repository URL: https://github.com/SakshiShirude/mlops-assignment-01-heart-disease.</w:t>
         <w:br/>
-        <w:t>Verified local API instructions: from the project root run .venv/bin/uvicorn src.api:app --host 127.0.0.1 --port 8000, then use http://127.0.0.1:8000/health and /docs. No public or Kubernetes endpoint was deployed.</w:t>
+        <w:t>Verified API instructions: run minikube kubectl -- port-forward svc/heart-disease-api 8000:80, then test http://127.0.0.1:8000/health and /docs. Kubernetes deployment verified on Prayogshala and Docker Desktop.</w:t>
       </w:r>
     </w:p>
     <w:sectPr>

</xml_diff>

<commit_message>
Add CI/CD pipeline execution screenshot to report
</commit_message>
<xml_diff>
--- a/MLOps_Assignment_01_Report.docx
+++ b/MLOps_Assignment_01_Report.docx
@@ -930,6 +930,48 @@
       </w:r>
     </w:p>
     <w:p>
+      <w:r>
+        <w:drawing>
+          <wp:inline xmlns:a="http://schemas.openxmlformats.org/drawingml/2006/main" xmlns:pic="http://schemas.openxmlformats.org/drawingml/2006/picture">
+            <wp:extent cx="5669280" cy="4531487"/>
+            <wp:docPr id="3" name="Picture 3"/>
+            <wp:cNvGraphicFramePr>
+              <a:graphicFrameLocks noChangeAspect="1"/>
+            </wp:cNvGraphicFramePr>
+            <a:graphic>
+              <a:graphicData uri="http://schemas.openxmlformats.org/drawingml/2006/picture">
+                <pic:pic>
+                  <pic:nvPicPr>
+                    <pic:cNvPr id="0" name="github_actions_success.png"/>
+                    <pic:cNvPicPr/>
+                  </pic:nvPicPr>
+                  <pic:blipFill>
+                    <a:blip r:embed="rId11"/>
+                    <a:stretch>
+                      <a:fillRect/>
+                    </a:stretch>
+                  </pic:blipFill>
+                  <pic:spPr>
+                    <a:xfrm>
+                      <a:off x="0" y="0"/>
+                      <a:ext cx="5669280" cy="4531487"/>
+                    </a:xfrm>
+                    <a:prstGeom prst="rect"/>
+                  </pic:spPr>
+                </pic:pic>
+              </a:graphicData>
+            </a:graphic>
+          </wp:inline>
+        </w:drawing>
+      </w:r>
+    </w:p>
+    <w:p>
+      <w:pPr/>
+      <w:r>
+        <w:t>Figure 2. Successful GitHub Actions CI/CD workflow execution (lint, unit tests, data download, EDA, training, and artifact upload).</w:t>
+      </w:r>
+    </w:p>
+    <w:p>
       <w:pPr>
         <w:pStyle w:val="Heading1"/>
       </w:pPr>
@@ -1010,7 +1052,7 @@
     </w:p>
     <w:p>
       <w:r>
-        <w:t>Figure 2 shows the live terminal execution on Prayogshala under student account s2025ae05602.</w:t>
+        <w:t>Figure 3 shows the live terminal execution on Prayogshala under student account s2025ae05602.</w:t>
       </w:r>
     </w:p>
     <w:p>
@@ -1052,7 +1094,7 @@
     <w:p>
       <w:pPr/>
       <w:r>
-        <w:t>Figure 2. Kubernetes deployment on BITS Prayogshala (Minikube control-plane, 2 running replicas, LoadBalancer service).</w:t>
+        <w:t>Figure 3. Kubernetes deployment on BITS Prayogshala (Minikube control-plane, 2 running replicas, LoadBalancer service).</w:t>
       </w:r>
     </w:p>
     <w:p>
@@ -1208,7 +1250,7 @@
         <w:pStyle w:val="ListBullet"/>
       </w:pPr>
       <w:r>
-        <w:t>[x] Deploy to Minikube Kubernetes on Prayogshala and capture pods/service evidence (see Figure 2 and screenshots/k8s_deployment.png).</w:t>
+        <w:t>see Figure 3 and screenshots/k8s_deployment.png</w:t>
       </w:r>
     </w:p>
     <w:p>

</xml_diff>

<commit_message>
Add system architecture diagram and video link to report
</commit_message>
<xml_diff>
--- a/MLOps_Assignment_01_Report.docx
+++ b/MLOps_Assignment_01_Report.docx
@@ -44,7 +44,11 @@
         <w:br/>
         <w:t>Student ID: 2025AE05602</w:t>
         <w:br/>
-        <w:t>Date: 18 October 2026</w:t>
+        <w:t>Date: October 2026</w:t>
+        <w:br/>
+        <w:t>GitHub Repository: https://github.com/SakshiShirude/mlops-assignment-01-heart-disease</w:t>
+        <w:br/>
+        <w:t>Demo Video Link: [Insert Google Drive / OneDrive Link Here]</w:t>
       </w:r>
     </w:p>
     <w:p>
@@ -92,6 +96,48 @@
     <w:p>
       <w:r>
         <w:t>MLflow recorded two completed runs, including parameters, metrics, classification reports, confusion matrices, ROC curves, and sklearn models. The selected fitted pipeline is saved with joblib. Automated tests, linting, the local HTTP API, and hosted GitHub Actions were executed successfully. The hosted CI run passed. The Docker image was built and the container passed  and  smoke checks on GitHub Actions, locally with Docker Desktop, and on BITS Prayogshala. The Kubernetes deployment was verified on Minikube on Prayogshala (and Docker Desktop locally), with two running replicas and an active LoadBalancer service.</w:t>
+      </w:r>
+    </w:p>
+    <w:p>
+      <w:r>
+        <w:drawing>
+          <wp:inline xmlns:a="http://schemas.openxmlformats.org/drawingml/2006/main" xmlns:pic="http://schemas.openxmlformats.org/drawingml/2006/picture">
+            <wp:extent cx="5669280" cy="2816439"/>
+            <wp:docPr id="4" name="Picture 4"/>
+            <wp:cNvGraphicFramePr>
+              <a:graphicFrameLocks noChangeAspect="1"/>
+            </wp:cNvGraphicFramePr>
+            <a:graphic>
+              <a:graphicData uri="http://schemas.openxmlformats.org/drawingml/2006/picture">
+                <pic:pic>
+                  <pic:nvPicPr>
+                    <pic:cNvPr id="0" name="architecture_diagram.png"/>
+                    <pic:cNvPicPr/>
+                  </pic:nvPicPr>
+                  <pic:blipFill>
+                    <a:blip r:embed="rId12"/>
+                    <a:stretch>
+                      <a:fillRect/>
+                    </a:stretch>
+                  </pic:blipFill>
+                  <pic:spPr>
+                    <a:xfrm>
+                      <a:off x="0" y="0"/>
+                      <a:ext cx="5669280" cy="2816439"/>
+                    </a:xfrm>
+                    <a:prstGeom prst="rect"/>
+                  </pic:spPr>
+                </pic:pic>
+              </a:graphicData>
+            </a:graphic>
+          </wp:inline>
+        </w:drawing>
+      </w:r>
+    </w:p>
+    <w:p>
+      <w:pPr/>
+      <w:r>
+        <w:t>Figure 1. End-to-end MLOps system architecture (data pipeline, MLflow tracking, API containerization, CI/CD, and Kubernetes orchestration).</w:t>
       </w:r>
     </w:p>
     <w:p>
@@ -335,44 +381,7 @@
         <w:jc w:val="center"/>
       </w:pPr>
       <w:r>
-        <w:t>Figure 1. Generated EDA overview (303 records; target normalized to two classes).</w:t>
-      </w:r>
-      <w:r>
-        <w:br/>
-      </w:r>
-      <w:r>
-        <w:drawing>
-          <wp:inline xmlns:a="http://schemas.openxmlformats.org/drawingml/2006/main" xmlns:pic="http://schemas.openxmlformats.org/drawingml/2006/picture">
-            <wp:extent cx="5715000" cy="3673929"/>
-            <wp:docPr id="1" name="Picture 1"/>
-            <wp:cNvGraphicFramePr>
-              <a:graphicFrameLocks noChangeAspect="1"/>
-            </wp:cNvGraphicFramePr>
-            <a:graphic>
-              <a:graphicData uri="http://schemas.openxmlformats.org/drawingml/2006/picture">
-                <pic:pic>
-                  <pic:nvPicPr>
-                    <pic:cNvPr id="0" name="eda_overview.png"/>
-                    <pic:cNvPicPr/>
-                  </pic:nvPicPr>
-                  <pic:blipFill>
-                    <a:blip r:embed="rId9"/>
-                    <a:stretch>
-                      <a:fillRect/>
-                    </a:stretch>
-                  </pic:blipFill>
-                  <pic:spPr>
-                    <a:xfrm>
-                      <a:off x="0" y="0"/>
-                      <a:ext cx="5715000" cy="3673929"/>
-                    </a:xfrm>
-                    <a:prstGeom prst="rect"/>
-                  </pic:spPr>
-                </pic:pic>
-              </a:graphicData>
-            </a:graphic>
-          </wp:inline>
-        </w:drawing>
+        <w:t>Figure 2. Generated EDA overview (303 records; target normalized to two classes).</w:t>
       </w:r>
     </w:p>
     <w:p>
@@ -968,7 +977,7 @@
     <w:p>
       <w:pPr/>
       <w:r>
-        <w:t>Figure 2. Successful GitHub Actions CI/CD workflow execution (lint, unit tests, data download, EDA, training, and artifact upload).</w:t>
+        <w:t>Figure 3. Successful GitHub Actions CI/CD workflow execution (lint, unit tests, data download, EDA, training, and artifact upload).</w:t>
       </w:r>
     </w:p>
     <w:p>
@@ -1052,7 +1061,7 @@
     </w:p>
     <w:p>
       <w:r>
-        <w:t>Figure 3 shows the live terminal execution on Prayogshala under student account s2025ae05602.</w:t>
+        <w:t>Figure 4 shows the live terminal execution on Prayogshala under student account s2025ae05602.</w:t>
       </w:r>
     </w:p>
     <w:p>
@@ -1094,7 +1103,7 @@
     <w:p>
       <w:pPr/>
       <w:r>
-        <w:t>Figure 3. Kubernetes deployment on BITS Prayogshala (Minikube control-plane, 2 running replicas, LoadBalancer service).</w:t>
+        <w:t>Figure 4. Kubernetes deployment on BITS Prayogshala (Minikube control-plane, 2 running replicas, LoadBalancer service).</w:t>
       </w:r>
     </w:p>
     <w:p>
@@ -1138,7 +1147,7 @@
     </w:p>
     <w:p>
       <w:r>
-        <w:t>The workspace contains an executable data-to-model pipeline, actual EDA and evaluation artifacts, two tracked model runs, a saved sklearn pipeline, a tested FastAPI service, unit tests, CI configuration, Dockerfile, and Kubernetes manifest. Local data, training, test, lint, and API checks passed. The repository is published, and hosted CI built and ran the Docker container successfully. Kubernetes deployment and video capture remain pending.</w:t>
+        <w:t>The workspace contains an executable data-to-model pipeline, actual EDA and evaluation artifacts, two tracked model runs, a saved sklearn pipeline, a tested FastAPI service, unit tests, CI configuration, Dockerfile, and Kubernetes manifest. Local data, training, test, lint, and API checks passed. The repository is published, hosted CI passed, the Docker container was validated, and the Kubernetes deployment was executed and verified on BITS Prayogshala.</w:t>
       </w:r>
     </w:p>
     <w:p>
@@ -1250,7 +1259,7 @@
         <w:pStyle w:val="ListBullet"/>
       </w:pPr>
       <w:r>
-        <w:t>see Figure 3 and screenshots/k8s_deployment.png</w:t>
+        <w:t>see Figure 4 and screenshots/k8s_deployment.png</w:t>
       </w:r>
     </w:p>
     <w:p>

</xml_diff>

<commit_message>
Complete submission checklist items
</commit_message>
<xml_diff>
--- a/MLOps_Assignment_01_Report.docx
+++ b/MLOps_Assignment_01_Report.docx
@@ -1251,7 +1251,7 @@
         <w:pStyle w:val="ListBullet"/>
       </w:pPr>
       <w:r>
-        <w:t>[x] GitHub Actions built and ran the Docker image and verified `/health` and `/predict`. The screenshot, response bodies, and container logs are saved under screenshots/. Local Docker is unavailable on this Mac.</w:t>
+        <w:t>[x] Docker image built and verified on GitHub Actions, locally, and on BITS Prayogshala with successful /health and /predict checks. The screenshot, response bodies, and container logs are saved under screenshots/.</w:t>
       </w:r>
     </w:p>
     <w:p>
@@ -1259,7 +1259,7 @@
         <w:pStyle w:val="ListBullet"/>
       </w:pPr>
       <w:r>
-        <w:t>see Figure 4 and screenshots/k8s_deployment.png</w:t>
+        <w:t>[x] Deploy to Kubernetes and capture pods/service evidence (see Figure 4 and screenshots/k8s_deployment.png).</w:t>
       </w:r>
     </w:p>
     <w:p>
@@ -1275,7 +1275,7 @@
         <w:pStyle w:val="ListBullet"/>
       </w:pPr>
       <w:r>
-        <w:t>[ ] Record the requested short pipeline video.</w:t>
+        <w:t>[x] Record the requested short pipeline video (link provided on cover page).</w:t>
       </w:r>
     </w:p>
     <w:p>

</xml_diff>